<commit_message>
test(e2e): scope attachment input to Ekler region; regenerate Word guides
Co-Authored-By: Claude Sonnet 5.5 <noreply@anthropic.com>
</commit_message>
<xml_diff>
--- a/docs/Egebis-Seyir-Kullanim-Kilavuzu.docx
+++ b/docs/Egebis-Seyir-Kullanim-Kilavuzu.docx
@@ -1004,6 +1004,141 @@
     </w:p>
     <w:p>
       <w:pPr>
+        <w:pStyle w:val="Heading2"/>
+        <w:keepNext/>
+        <w:spacing w:after="70" w:before="200"/>
+      </w:pPr>
+      <w:r>
+        <w:rPr>
+          <w:b/>
+          <w:bCs/>
+          <w:sz w:val="24"/>
+          <w:szCs w:val="24"/>
+        </w:rPr>
+        <w:t xml:space="preserve">Sprint’leri yönetme</w:t>
+      </w:r>
+    </w:p>
+    <w:p>
+      <w:pPr>
+        <w:pStyle w:val="ListParagraph"/>
+        <w:numPr>
+          <w:ilvl w:val="0"/>
+          <w:numId w:val="4"/>
+        </w:numPr>
+        <w:spacing w:after="60"/>
+      </w:pPr>
+      <w:r>
+        <w:rPr>
+          <w:sz w:val="22"/>
+          <w:szCs w:val="22"/>
+        </w:rPr>
+        <w:t xml:space="preserve">Sol menüde “Backlog ve sprint’ler” satırının okuna basınca Space’in tüm sprint’leri altında listelenir; birine tıklarsan o sprint’in panosu açılır.</w:t>
+      </w:r>
+    </w:p>
+    <w:p>
+      <w:pPr>
+        <w:pStyle w:val="ListParagraph"/>
+        <w:numPr>
+          <w:ilvl w:val="0"/>
+          <w:numId w:val="4"/>
+        </w:numPr>
+        <w:spacing w:after="60"/>
+      </w:pPr>
+      <w:r>
+        <w:rPr>
+          <w:sz w:val="22"/>
+          <w:szCs w:val="22"/>
+        </w:rPr>
+        <w:t xml:space="preserve">Backlog sayfasında bir işi tutamacından sürükleyip Backlog, sprint’ler ya da başka bir sprint üstüne bırakabilirsin. Satırdaki “⋯” menüsünden de taşıyabilirsin.</w:t>
+      </w:r>
+    </w:p>
+    <w:p>
+      <w:pPr>
+        <w:pStyle w:val="ListParagraph"/>
+        <w:numPr>
+          <w:ilvl w:val="0"/>
+          <w:numId w:val="4"/>
+        </w:numPr>
+        <w:spacing w:after="60"/>
+      </w:pPr>
+      <w:r>
+        <w:rPr>
+          <w:sz w:val="22"/>
+          <w:szCs w:val="22"/>
+        </w:rPr>
+        <w:t xml:space="preserve">Bir işi başka bir işin üstüne sağa doğru kaydırarak bırakırsan o işin alt işi olur. Task başka Task’ın altına girerse Sub-task’a dönüşür; üstteki işin tipi değişmez.</w:t>
+      </w:r>
+    </w:p>
+    <w:p>
+      <w:pPr>
+        <w:pStyle w:val="ListParagraph"/>
+        <w:numPr>
+          <w:ilvl w:val="0"/>
+          <w:numId w:val="4"/>
+        </w:numPr>
+        <w:spacing w:after="60"/>
+      </w:pPr>
+      <w:r>
+        <w:rPr>
+          <w:sz w:val="22"/>
+          <w:szCs w:val="22"/>
+        </w:rPr>
+        <w:t xml:space="preserve">“Listeyi kopyala” sprint ya da Backlog listesini panoya alır; Excel’e yapıştırınca sütunlara ayrılır.</w:t>
+      </w:r>
+    </w:p>
+    <w:p>
+      <w:pPr>
+        <w:pStyle w:val="ListParagraph"/>
+        <w:numPr>
+          <w:ilvl w:val="0"/>
+          <w:numId w:val="4"/>
+        </w:numPr>
+        <w:spacing w:after="60"/>
+      </w:pPr>
+      <w:r>
+        <w:rPr>
+          <w:sz w:val="22"/>
+          <w:szCs w:val="22"/>
+        </w:rPr>
+        <w:t xml:space="preserve">“Excel” menüsü ve sprint’in “⋯” menüsü: sprint’i (işler, atanan, öncelik, puan, tarihler, alt işler, bağımlılıklar) Excel’e aktar; aynı dosyayı “Excel’den içe aktar” ile geri al. İçe aktarmadan önce dosya kontrol edilir. Numarası (ID) bu Space’te olan işler güncellenir, olmayanlar yeni açılır.</w:t>
+      </w:r>
+    </w:p>
+    <w:p>
+      <w:pPr>
+        <w:pStyle w:val="ListParagraph"/>
+        <w:numPr>
+          <w:ilvl w:val="0"/>
+          <w:numId w:val="4"/>
+        </w:numPr>
+        <w:spacing w:after="60"/>
+      </w:pPr>
+      <w:r>
+        <w:rPr>
+          <w:sz w:val="22"/>
+          <w:szCs w:val="22"/>
+        </w:rPr>
+        <w:t xml:space="preserve">Sprint’in “⋯” menüsünden “Sprint yedeğini indir (ZIP)”; Backlog sayfasındaki “Excel” menüsünden “Yedekten sprint yükle…”. Yorumlar, checklist’ler ve ek dosyalar da yedeğe girer.</w:t>
+      </w:r>
+    </w:p>
+    <w:p>
+      <w:pPr>
+        <w:pStyle w:val="ListParagraph"/>
+        <w:numPr>
+          <w:ilvl w:val="0"/>
+          <w:numId w:val="4"/>
+        </w:numPr>
+        <w:spacing w:after="60"/>
+      </w:pPr>
+      <w:r>
+        <w:rPr>
+          <w:sz w:val="22"/>
+          <w:szCs w:val="22"/>
+        </w:rPr>
+        <w:t xml:space="preserve">Bir işin numarasına (ör. MOB-12) tıklarsan o işin bağlantısı kopyalanır. Bu bağlantı işi doğrudan açar.</w:t>
+      </w:r>
+    </w:p>
+    <w:p>
+      <w:pPr>
         <w:pStyle w:val="Heading1"/>
         <w:keepNext/>
         <w:spacing w:after="100" w:before="360"/>
@@ -1169,7 +1304,24 @@
           <w:sz w:val="22"/>
           <w:szCs w:val="22"/>
         </w:rPr>
-        <w:t xml:space="preserve">“Markdown indir” ya da “Yazdır / PDF” ile dışarı al.</w:t>
+        <w:t xml:space="preserve">Araç çubuğundaki görsel düğmesiyle ya da panodan yapıştırarak / sürükleyerek sayfaya resim ekle. Geri al / Yinele düğmeleri (Ctrl+Z, Ctrl+Shift+Z) yazdıklarını geri getirir.</w:t>
+      </w:r>
+    </w:p>
+    <w:p>
+      <w:pPr>
+        <w:pStyle w:val="ListParagraph"/>
+        <w:numPr>
+          <w:ilvl w:val="0"/>
+          <w:numId w:val="8"/>
+        </w:numPr>
+        <w:spacing w:after="70"/>
+      </w:pPr>
+      <w:r>
+        <w:rPr>
+          <w:sz w:val="22"/>
+          <w:szCs w:val="22"/>
+        </w:rPr>
+        <w:t xml:space="preserve">“Word olarak indir”, “Markdown indir” ya da “Yazdır / PDF” ile dışarı al.</w:t>
       </w:r>
     </w:p>
     <w:p>
@@ -2087,6 +2239,128 @@
                 <w:szCs w:val="21"/>
               </w:rPr>
               <w:t xml:space="preserve">Ayarlar → Arşiv sayfasındaki çöp kutusundan 30 gün içinde geri getirebilirsin.</w:t>
+            </w:r>
+          </w:p>
+        </w:tc>
+      </w:tr>
+      <w:tr>
+        <w:trPr>
+          <w:cantSplit/>
+        </w:trPr>
+        <w:tc>
+          <w:tcPr>
+            <w:tcW w:type="dxa" w:w="2600"/>
+            <w:tcBorders>
+              <w:top w:val="single" w:color="D4D4D8" w:sz="4"/>
+              <w:left w:val="single" w:color="D4D4D8" w:sz="4"/>
+              <w:bottom w:val="single" w:color="D4D4D8" w:sz="4"/>
+              <w:right w:val="single" w:color="D4D4D8" w:sz="4"/>
+            </w:tcBorders>
+            <w:tcMar>
+              <w:top w:type="dxa" w:w="80"/>
+              <w:left w:type="dxa" w:w="120"/>
+              <w:bottom w:type="dxa" w:w="80"/>
+              <w:right w:type="dxa" w:w="120"/>
+            </w:tcMar>
+          </w:tcPr>
+          <w:p>
+            <w:r>
+              <w:rPr>
+                <w:b/>
+                <w:bCs/>
+                <w:sz w:val="21"/>
+                <w:szCs w:val="21"/>
+              </w:rPr>
+              <w:t xml:space="preserve">Kimin ne yaptığını görmek istiyorum</w:t>
+            </w:r>
+          </w:p>
+        </w:tc>
+        <w:tc>
+          <w:tcPr>
+            <w:tcW w:type="dxa" w:w="6706"/>
+            <w:tcBorders>
+              <w:top w:val="single" w:color="D4D4D8" w:sz="4"/>
+              <w:left w:val="single" w:color="D4D4D8" w:sz="4"/>
+              <w:bottom w:val="single" w:color="D4D4D8" w:sz="4"/>
+              <w:right w:val="single" w:color="D4D4D8" w:sz="4"/>
+            </w:tcBorders>
+            <w:tcMar>
+              <w:top w:type="dxa" w:w="80"/>
+              <w:left w:type="dxa" w:w="120"/>
+              <w:bottom w:type="dxa" w:w="80"/>
+              <w:right w:type="dxa" w:w="120"/>
+            </w:tcMar>
+          </w:tcPr>
+          <w:p>
+            <w:r>
+              <w:rPr>
+                <w:b w:val="false"/>
+                <w:bCs w:val="false"/>
+                <w:sz w:val="21"/>
+                <w:szCs w:val="21"/>
+              </w:rPr>
+              <w:t xml:space="preserve">Sahip ve Yöneticiler Ayarlar → Denetim günlüğü sayfasını açar. Kişiye, türe ve tarihe göre süzer, CSV olarak indirir.</w:t>
+            </w:r>
+          </w:p>
+        </w:tc>
+      </w:tr>
+      <w:tr>
+        <w:trPr>
+          <w:cantSplit/>
+        </w:trPr>
+        <w:tc>
+          <w:tcPr>
+            <w:tcW w:type="dxa" w:w="2600"/>
+            <w:tcBorders>
+              <w:top w:val="single" w:color="D4D4D8" w:sz="4"/>
+              <w:left w:val="single" w:color="D4D4D8" w:sz="4"/>
+              <w:bottom w:val="single" w:color="D4D4D8" w:sz="4"/>
+              <w:right w:val="single" w:color="D4D4D8" w:sz="4"/>
+            </w:tcBorders>
+            <w:tcMar>
+              <w:top w:type="dxa" w:w="80"/>
+              <w:left w:type="dxa" w:w="120"/>
+              <w:bottom w:type="dxa" w:w="80"/>
+              <w:right w:type="dxa" w:w="120"/>
+            </w:tcMar>
+          </w:tcPr>
+          <w:p>
+            <w:r>
+              <w:rPr>
+                <w:b/>
+                <w:bCs/>
+                <w:sz w:val="21"/>
+                <w:szCs w:val="21"/>
+              </w:rPr>
+              <w:t xml:space="preserve">Bir Space’i yedeklemek / geri yüklemek</w:t>
+            </w:r>
+          </w:p>
+        </w:tc>
+        <w:tc>
+          <w:tcPr>
+            <w:tcW w:type="dxa" w:w="6706"/>
+            <w:tcBorders>
+              <w:top w:val="single" w:color="D4D4D8" w:sz="4"/>
+              <w:left w:val="single" w:color="D4D4D8" w:sz="4"/>
+              <w:bottom w:val="single" w:color="D4D4D8" w:sz="4"/>
+              <w:right w:val="single" w:color="D4D4D8" w:sz="4"/>
+            </w:tcBorders>
+            <w:tcMar>
+              <w:top w:type="dxa" w:w="80"/>
+              <w:left w:type="dxa" w:w="120"/>
+              <w:bottom w:type="dxa" w:w="80"/>
+              <w:right w:type="dxa" w:w="120"/>
+            </w:tcMar>
+          </w:tcPr>
+          <w:p>
+            <w:r>
+              <w:rPr>
+                <w:b w:val="false"/>
+                <w:bCs w:val="false"/>
+                <w:sz w:val="21"/>
+                <w:szCs w:val="21"/>
+              </w:rPr>
+              <w:t xml:space="preserve">Yedek: Space ayarları → Yedek → ZIP indir. Geri yükleme: Ayarlar → Genel → “Yedekten Space yükle” (yeni anahtar verirsin; mevcut hiçbir şeyin üzerine yazılmaz).</w:t>
             </w:r>
           </w:p>
         </w:tc>

</xml_diff>